<commit_message>
Remove annexes from project report
</commit_message>
<xml_diff>
--- a/docs/relatorio.docx
+++ b/docs/relatorio.docx
@@ -815,33 +815,6 @@
         <w:t xml:space="preserve">Bibliografia </w:t>
       </w:r>
     </w:p>
-    <w:p>
-      <w:pPr>
-        <w:pStyle w:val="ListParagraph"/>
-        <w:numPr>
-          <w:ilvl w:val="0"/>
-          <w:numId w:val="1"/>
-        </w:numPr>
-        <w:spacing w:before="0" w:beforeAutospacing="off" w:after="0" w:afterAutospacing="off"/>
-        <w:rPr>
-          <w:rFonts w:ascii="Aptos" w:hAnsi="Aptos" w:eastAsia="Aptos" w:cs="Aptos"/>
-          <w:noProof w:val="0"/>
-          <w:sz w:val="24"/>
-          <w:szCs w:val="24"/>
-          <w:lang w:val="pt-PT"/>
-        </w:rPr>
-      </w:pPr>
-      <w:r>
-        <w:rPr>
-          <w:rFonts w:ascii="Aptos" w:hAnsi="Aptos" w:eastAsia="Aptos" w:cs="Aptos"/>
-          <w:noProof w:val="0"/>
-          <w:sz w:val="24"/>
-          <w:szCs w:val="24"/>
-          <w:lang w:val="pt-PT"/>
-        </w:rPr>
-        <w:t xml:space="preserve">Anexos </w:t>
-      </w:r>
-    </w:p>
     <w:p/>
     <w:p>
       <w:pPr>
@@ -17538,165 +17511,6 @@
           <w:lang w:val="pt-PT"/>
         </w:rPr>
         <w:t xml:space="preserve">    • Boas práticas de usabilidade e acessibilidade web. </w:t>
-      </w:r>
-    </w:p>
-    <w:p>
-      <w:pPr>
-        <w:pStyle w:val="Heading1"/>
-        <w:spacing w:before="322" w:beforeAutospacing="off" w:after="322" w:afterAutospacing="off"/>
-      </w:pPr>
-      <w:r>
-        <w:rPr>
-          <w:rFonts w:ascii="Aptos" w:hAnsi="Aptos" w:eastAsia="Aptos" w:cs="Aptos"/>
-          <w:b w:val="1"/>
-          <w:bCs w:val="1"/>
-          <w:noProof w:val="0"/>
-          <w:sz w:val="48"/>
-          <w:szCs w:val="48"/>
-          <w:lang w:val="pt-PT"/>
-        </w:rPr>
-        <w:t>23. ANEXOS</w:t>
-      </w:r>
-    </w:p>
-    <w:p>
-      <w:pPr>
-        <w:spacing w:before="240" w:beforeAutospacing="off" w:after="240" w:afterAutospacing="off"/>
-      </w:pPr>
-      <w:r>
-        <w:rPr>
-          <w:rFonts w:ascii="Aptos" w:hAnsi="Aptos" w:eastAsia="Aptos" w:cs="Aptos"/>
-          <w:noProof w:val="0"/>
-          <w:sz w:val="24"/>
-          <w:szCs w:val="24"/>
-          <w:lang w:val="pt-PT"/>
-        </w:rPr>
-        <w:t>Os anexos incluem evidências de validação do projeto e prints das funcionalidades implementadas na versão publicada do website.</w:t>
-      </w:r>
-    </w:p>
-    <w:p>
-      <w:pPr>
-        <w:pStyle w:val="Heading2"/>
-        <w:spacing w:before="299" w:beforeAutospacing="off" w:after="299" w:afterAutospacing="off"/>
-      </w:pPr>
-      <w:r>
-        <w:rPr>
-          <w:rFonts w:ascii="Aptos" w:hAnsi="Aptos" w:eastAsia="Aptos" w:cs="Aptos"/>
-          <w:b w:val="1"/>
-          <w:bCs w:val="1"/>
-          <w:noProof w:val="0"/>
-          <w:sz w:val="36"/>
-          <w:szCs w:val="36"/>
-          <w:lang w:val="pt-PT"/>
-        </w:rPr>
-        <w:t>23.1 Prints de Validação</w:t>
-      </w:r>
-    </w:p>
-    <w:p>
-      <w:pPr>
-        <w:spacing w:before="240" w:beforeAutospacing="off" w:after="240" w:afterAutospacing="off"/>
-      </w:pPr>
-      <w:r>
-        <w:rPr>
-          <w:rFonts w:ascii="Aptos" w:hAnsi="Aptos" w:eastAsia="Aptos" w:cs="Aptos"/>
-          <w:noProof w:val="0"/>
-          <w:sz w:val="24"/>
-          <w:szCs w:val="24"/>
-          <w:lang w:val="pt-PT"/>
-        </w:rPr>
-        <w:t>Foram gerados prints da versão publicada no GitHub Pages para comprovar as alterações realizadas.</w:t>
-      </w:r>
-    </w:p>
-    <w:p>
-      <w:pPr>
-        <w:spacing w:before="240" w:beforeAutospacing="off" w:after="240" w:afterAutospacing="off"/>
-      </w:pPr>
-      <w:r>
-        <w:rPr>
-          <w:rFonts w:ascii="Aptos" w:hAnsi="Aptos" w:eastAsia="Aptos" w:cs="Aptos"/>
-          <w:noProof w:val="0"/>
-          <w:sz w:val="24"/>
-          <w:szCs w:val="24"/>
-          <w:lang w:val="pt-PT"/>
-        </w:rPr>
-        <w:t xml:space="preserve">    • Checkout com pagamento fictício por cartão: https://velotechciclism.github.io/screenshots/07-checkout-pagamento-ficticio-cartao.png; </w:t>
-      </w:r>
-    </w:p>
-    <w:p>
-      <w:pPr>
-        <w:spacing w:before="240" w:beforeAutospacing="off" w:after="240" w:afterAutospacing="off"/>
-      </w:pPr>
-      <w:r>
-        <w:rPr>
-          <w:rFonts w:ascii="Aptos" w:hAnsi="Aptos" w:eastAsia="Aptos" w:cs="Aptos"/>
-          <w:noProof w:val="0"/>
-          <w:sz w:val="24"/>
-          <w:szCs w:val="24"/>
-          <w:lang w:val="pt-PT"/>
-        </w:rPr>
-        <w:t xml:space="preserve">    • Página de contacto sem a secção "Envie-nos uma Mensagem": https://velotechciclism.github.io/screenshots/08-contato-sem-formulario-mensagem.png; </w:t>
-      </w:r>
-    </w:p>
-    <w:p>
-      <w:pPr>
-        <w:spacing w:before="240" w:beforeAutospacing="off" w:after="240" w:afterAutospacing="off"/>
-      </w:pPr>
-      <w:r>
-        <w:rPr>
-          <w:rFonts w:ascii="Aptos" w:hAnsi="Aptos" w:eastAsia="Aptos" w:cs="Aptos"/>
-          <w:noProof w:val="0"/>
-          <w:sz w:val="24"/>
-          <w:szCs w:val="24"/>
-          <w:lang w:val="pt-PT"/>
-        </w:rPr>
-        <w:t xml:space="preserve">    • Menu Select com tema escuro: https://velotechciclism.github.io/screenshots/09-select-tema-escuro-produtos.png. </w:t>
-      </w:r>
-    </w:p>
-    <w:p>
-      <w:pPr>
-        <w:pStyle w:val="Heading2"/>
-        <w:spacing w:before="299" w:beforeAutospacing="off" w:after="299" w:afterAutospacing="off"/>
-      </w:pPr>
-      <w:r>
-        <w:rPr>
-          <w:rFonts w:ascii="Aptos" w:hAnsi="Aptos" w:eastAsia="Aptos" w:cs="Aptos"/>
-          <w:b w:val="1"/>
-          <w:bCs w:val="1"/>
-          <w:noProof w:val="0"/>
-          <w:sz w:val="36"/>
-          <w:szCs w:val="36"/>
-          <w:lang w:val="pt-PT"/>
-        </w:rPr>
-        <w:t>23.2 Documentação Complementar</w:t>
-      </w:r>
-    </w:p>
-    <w:p>
-      <w:pPr>
-        <w:spacing w:before="240" w:beforeAutospacing="off" w:after="240" w:afterAutospacing="off"/>
-      </w:pPr>
-      <w:r>
-        <w:rPr>
-          <w:rFonts w:ascii="Aptos" w:hAnsi="Aptos" w:eastAsia="Aptos" w:cs="Aptos"/>
-          <w:noProof w:val="0"/>
-          <w:sz w:val="24"/>
-          <w:szCs w:val="24"/>
-          <w:lang w:val="pt-PT"/>
-        </w:rPr>
-        <w:t>Também foram criados documentos de apoio dentro da pasta docs, incluindo roteiro de vídeo, auditoria técnica e explicações sobre a arquitetura do projeto.</w:t>
-      </w:r>
-    </w:p>
-    <w:p>
-      <w:pPr>
-        <w:spacing w:before="240" w:beforeAutospacing="off" w:after="240" w:afterAutospacing="off"/>
-      </w:pPr>
-      <w:r>
-        <w:rPr>
-          <w:rFonts w:ascii="Aptos" w:hAnsi="Aptos" w:eastAsia="Aptos" w:cs="Aptos"/>
-          <w:noProof w:val="0"/>
-          <w:sz w:val="24"/>
-          <w:szCs w:val="24"/>
-          <w:lang w:val="pt-PT"/>
-        </w:rPr>
-        <w:t>Estes documentos ajudam a compreender o funcionamento do sistema, os ficheiros alterados, as funções implementadas e a forma como os dados são armazenados no SQLite local.</w:t>
       </w:r>
     </w:p>
     <w:sectPr>

</xml_diff>